<commit_message>
SAD: add course faculty name to approvals
</commit_message>
<xml_diff>
--- a/docs/SAD/Team10_Vehicle_Parking_System_SAD.docx
+++ b/docs/SAD/Team10_Vehicle_Parking_System_SAD.docx
@@ -804,6 +804,7 @@
               <w:rPr>
                 <w:sz w:val="19"/>
               </w:rPr>
+              <w:t>Ashok Patil</w:t>
             </w:r>
           </w:p>
         </w:tc>
@@ -13500,15 +13501,6 @@
       </w:pPr>
       <w:r>
         <w:t>Default hourly rates (SRS 2.6) to be confirmed by the reviewer before system testing.</w:t>
-      </w:r>
-    </w:p>
-    <w:p>
-      <w:pPr>
-        <w:pStyle w:val="ListBullet"/>
-        <w:spacing w:after="40"/>
-      </w:pPr>
-      <w:r>
-        <w:t>Group number to be filled on the cover pages of the SRS and the Test Plan.</w:t>
       </w:r>
     </w:p>
     <w:p>

</xml_diff>